<commit_message>
Rebuild intersection nodes from true geometry; index every junction citywide
Replace endpoint-noding junction builder (script 21) with true geometric
centerline intersection of differently-named through-roads, consolidating
divided-arterial carriageways into single nodes (30 m radius + same-pair
merge). Broaden the signal-coverage rule so any street carrying >=4 of its
own signals counts as covered (adds Union Ave + 270 others). Re-attribute
crashes to the full node set and index all 25,533 junctions for search,
including zero-crash junctions ("0 incidents reported here").

Headline totals (1,294 crashes / 175 fatal) and the deadliest-corridor
ranking are unchanged and reconciled. Fixes Union Ave & S Cleveland St
(and similar real junctions) being unsearchable.

Co-Authored-By: Claude Opus 4.8 <noreply@anthropic.com>
</commit_message>
<xml_diff>
--- a/data/processed/novel_statistics.docx
+++ b/data/processed/novel_statistics.docx
@@ -2197,6 +2197,14 @@
       </w:pPr>
       <w:r>
         <w:t>Caveats: PROOF OF CONCEPT on Union only (the one corridor Phase 3a found OSM-complete). Signalized = TDOT (more complete than OSM signals); marked = OSM. Distance is along-corridor linear referencing. 'In Crosswalk' crashes are kept (struck at a crossing, ~0 ft).</w:t>
+      </w:r>
+    </w:p>
+    <w:p>
+      <w:pPr>
+        <w:pStyle w:val="ListBullet"/>
+      </w:pPr>
+      <w:r>
+        <w:t>Coverage-rule revision (2026-06-24): the 'covered corridor' flag was broadened. OLD rule -- each TDOT signal route was mapped to its single DOMINANT arterial (plus any &gt;=25% secondary), 56 corridors. NEW rule -- that set UNION any street directly carrying &gt;= 4 of its own nearest signals, 327 corridors. This adds 271 streets (A W WILLIS AVE, AARON BRENNER DR, ADAMS AVE, AIRLINE RD, ALABAMA AVE, ALTRURIA RD, AMBERGATE LN, APPLING RD...), most importantly UNION AVE (70 signals snap nearest to it, yet it is never the 'dominant' arterial on any single route, so the old rule missed it), bringing Union-corridor junctions into scope. Headline crash totals (1,294 / 175) and the deadliest-corridor counts are unaffected -- the flag only governs intersection signal-coverage scope, not crash attribution.</w:t>
       </w:r>
     </w:p>
     <w:sectPr>

</xml_diff>

<commit_message>
Live-update refresh engine with safety gates
scripts/28_auto_refresh.py: daily incremental probe (30-day-overlap date
floor) / monthly full re-pull, five safety gates (pull plausibility,
pipeline fail-fast, computed reconciliation, sanity bounds, no-change
short-circuit); reports status via GITHUB_OUTPUT; cannot publish itself.
(The GitHub Actions workflow that drives it lands in a separate commit —
pushing workflow files needs a workflow-scoped token.)

Also fixes a docx-integrity bug the automation test surfaced: script 23's
append truncated from its heading to end-of-document, deleting any section
appended after it (it had wiped the 2026-07-12 signal-split correction —
restored here); it now removes only its own section.

Co-Authored-By: Claude Fable 5 <noreply@anthropic.com>
</commit_message>
<xml_diff>
--- a/data/processed/novel_statistics.docx
+++ b/data/processed/novel_statistics.docx
@@ -2141,6 +2141,35 @@
     <w:p>
       <w:r>
         <w:t>The scope is signal-covered corridors only. Crashes at intersections OFF those corridors are excluded as 'no_signal_coverage' — they are NOT counted as unsignalized. Absence of signal data is not evidence of no signal. The signalized/unsignalized shares are descriptive; we do NOT claim unsignalized intersections are 'N times deadlier' from these raw counts (signalized intersections sit on the busiest arterials, which carry their own exposure).</w:t>
+      </w:r>
+    </w:p>
+    <w:p>
+      <w:pPr>
+        <w:pStyle w:val="Heading1"/>
+      </w:pPr>
+      <w:r>
+        <w:t>Correction — intersection signal split (appended 2026-07-12; restored 2026-07-13)</w:t>
+      </w:r>
+    </w:p>
+    <w:p>
+      <w:r>
+        <w:t>The Phase-3a figure "Within signal coverage: 177 crashes — at SIGNALIZED intersections 89 (50.3%), at UNSIGNALIZED 88 (49.7%)" is SUPERSEDED. It was computed on the original endpoint-snapped node set (script 21). After the intersection-node root fix (script 25) and crash re-attribution, the verified figure as of the 2026-05-26 window was:</w:t>
+      </w:r>
+    </w:p>
+    <w:p>
+      <w:pPr>
+        <w:pStyle w:val="ListBullet"/>
+      </w:pPr>
+      <w:r>
+        <w:t>Within signal coverage: 298 at-intersection crashes (24 fatal) — at SIGNALIZED intersections 119 (39.9%), at UNSIGNALIZED 179 (60.1%); fatal: signalized 11, unsignalized 13.</w:t>
+      </w:r>
+    </w:p>
+    <w:p>
+      <w:pPr>
+        <w:pStyle w:val="ListBullet"/>
+      </w:pPr>
+      <w:r>
+        <w:t>Computed from data/processed/shelby_crashes_signals.csv (at_intersection = True, intersection_signalized in {yes, no}); no_signal_coverage is not "no signal." Use ~40% / ~60%, not the earlier ~50/50. Recompute from the same file for the current window after any data refresh. (Restoration note: this section was accidentally deleted on 2026-07-13 by script 23s old truncate-to-end docx append, since fixed to remove only its own section.)</w:t>
       </w:r>
     </w:p>
     <w:p>

</xml_diff>